<commit_message>
Prior to pipizing Create_grid
</commit_message>
<xml_diff>
--- a/Notes.docx
+++ b/Notes.docx
@@ -12,6 +12,12 @@
     </w:p>
     <w:p>
       <w:r>
+        <w:t>Sept 4, 2025: since this section was first written, we have decided to go with uncorrected raw counts instead of doing distance sampling, so ignore references to it below.</w:t>
+      </w:r>
+    </w:p>
+    <w:p/>
+    <w:p>
+      <w:r>
         <w:t>This project create</w:t>
       </w:r>
       <w:r>
@@ -42,7 +48,13 @@
         <w:t xml:space="preserve"> includes all observations from ECSAS (regardless of DistMeth, InTransect, etc</w:t>
       </w:r>
       <w:r>
-        <w:t xml:space="preserve">.). Detections functions are fitted and adjusted abundances aggretated on a per sample (ie. watch) basis.  </w:t>
+        <w:t xml:space="preserve">.). Detections functions are fitted and adjusted abundances </w:t>
+      </w:r>
+      <w:r>
+        <w:t>aggregated</w:t>
+      </w:r>
+      <w:r>
+        <w:t xml:space="preserve"> on a per sample (ie. watch) basis.  </w:t>
       </w:r>
       <w:r>
         <w:t xml:space="preserve">Watch abundances are then aggregated to a 1 x 1 km grid. </w:t>
@@ -317,6 +329,9 @@
       <w:r>
         <w:t>Do distance sampling</w:t>
       </w:r>
+      <w:r>
+        <w:t xml:space="preserve"> – No, in discussions with Rob, Sarah, Carina, etc. they indicated this wasn’t necessary.</w:t>
+      </w:r>
     </w:p>
     <w:p>
       <w:pPr>
@@ -379,15 +394,7 @@
         <w:t xml:space="preserve">2025-04-03: finish aggregating all </w:t>
       </w:r>
       <w:r>
-        <w:t xml:space="preserve">species into a </w:t>
-      </w:r>
-      <w:proofErr w:type="gramStart"/>
-      <w:r>
-        <w:t>single seasonal shapefiles</w:t>
-      </w:r>
-      <w:proofErr w:type="gramEnd"/>
-      <w:r>
-        <w:t xml:space="preserve"> with 3 fields per species giving total, n_obs, and years.</w:t>
+        <w:t>species into a single seasonal shapefiles with 3 fields per species giving total, n_obs, and years.</w:t>
       </w:r>
     </w:p>
     <w:p>

</xml_diff>

<commit_message>
Update map and notes
</commit_message>
<xml_diff>
--- a/Notes.docx
+++ b/Notes.docx
@@ -209,13 +209,10 @@
         </w:numPr>
       </w:pPr>
       <w:r>
-        <w:t xml:space="preserve">DONE </w:t>
-      </w:r>
-      <w:r>
-        <w:t xml:space="preserve">Figure out how to combine all species into a single shapefile – 1 each for </w:t>
-      </w:r>
-      <w:r>
-        <w:t>each season and 1 for year round</w:t>
+        <w:t xml:space="preserve">Figure out why </w:t>
+      </w:r>
+      <w:r>
+        <w:t>aggregated result shapefiles don’t line up right in QGIS</w:t>
       </w:r>
     </w:p>
     <w:p>
@@ -230,25 +227,10 @@
         <w:t xml:space="preserve">DONE </w:t>
       </w:r>
       <w:r>
-        <w:t xml:space="preserve">Create a new rmd document </w:t>
-      </w:r>
-      <w:r>
-        <w:t xml:space="preserve">that builds a table showing every species, its membership in Seabirds and Waterbirds, and how many obs and </w:t>
-      </w:r>
-      <w:r>
-        <w:rPr>
-          <w:highlight w:val="yellow"/>
-        </w:rPr>
-        <w:t>in what years</w:t>
-      </w:r>
-      <w:r>
-        <w:t>.</w:t>
-      </w:r>
-      <w:r>
-        <w:t xml:space="preserve"> Should this use raw data or</w:t>
-      </w:r>
-      <w:r>
-        <w:t xml:space="preserve"> aggregated??</w:t>
+        <w:t xml:space="preserve">Figure out how to combine all species into a single shapefile – 1 each for </w:t>
+      </w:r>
+      <w:r>
+        <w:t>each season and 1 for year round</w:t>
       </w:r>
     </w:p>
     <w:p>
@@ -260,6 +242,39 @@
         </w:numPr>
       </w:pPr>
       <w:r>
+        <w:t xml:space="preserve">DONE </w:t>
+      </w:r>
+      <w:r>
+        <w:t xml:space="preserve">Create a new rmd document </w:t>
+      </w:r>
+      <w:r>
+        <w:t xml:space="preserve">that builds a table showing every species, its membership in Seabirds and Waterbirds, and how many obs and </w:t>
+      </w:r>
+      <w:r>
+        <w:rPr>
+          <w:highlight w:val="yellow"/>
+        </w:rPr>
+        <w:t>in what years</w:t>
+      </w:r>
+      <w:r>
+        <w:t>.</w:t>
+      </w:r>
+      <w:r>
+        <w:t xml:space="preserve"> Should this use raw data or</w:t>
+      </w:r>
+      <w:r>
+        <w:t xml:space="preserve"> aggregated??</w:t>
+      </w:r>
+    </w:p>
+    <w:p>
+      <w:pPr>
+        <w:pStyle w:val="ListParagraph"/>
+        <w:numPr>
+          <w:ilvl w:val="0"/>
+          <w:numId w:val="1"/>
+        </w:numPr>
+      </w:pPr>
+      <w:r>
         <w:t>DONE</w:t>
       </w:r>
       <w:r>
@@ -354,6 +369,7 @@
         </w:numPr>
       </w:pPr>
       <w:r>
+        <w:lastRenderedPageBreak/>
         <w:t>Do summary by IMRP Atlantic region</w:t>
       </w:r>
       <w:r>

</xml_diff>

<commit_message>
Version 1 Atlantic OPP
- add 1 km ID, 5 km ET_ID, surv_yrs
- get watch location from obs if non-existent (probably not used
</commit_message>
<xml_diff>
--- a/Notes.docx
+++ b/Notes.docx
@@ -209,10 +209,7 @@
         </w:numPr>
       </w:pPr>
       <w:r>
-        <w:t xml:space="preserve">Figure out why </w:t>
-      </w:r>
-      <w:r>
-        <w:t>aggregated result shapefiles don’t line up right in QGIS</w:t>
+        <w:t>Remove COEI</w:t>
       </w:r>
     </w:p>
     <w:p>
@@ -224,13 +221,7 @@
         </w:numPr>
       </w:pPr>
       <w:r>
-        <w:t xml:space="preserve">DONE </w:t>
-      </w:r>
-      <w:r>
-        <w:t xml:space="preserve">Figure out how to combine all species into a single shapefile – 1 each for </w:t>
-      </w:r>
-      <w:r>
-        <w:t>each season and 1 for year round</w:t>
+        <w:t>Get ET_ID from 5km grid into result.</w:t>
       </w:r>
     </w:p>
     <w:p>
@@ -245,25 +236,10 @@
         <w:t xml:space="preserve">DONE </w:t>
       </w:r>
       <w:r>
-        <w:t xml:space="preserve">Create a new rmd document </w:t>
-      </w:r>
-      <w:r>
-        <w:t xml:space="preserve">that builds a table showing every species, its membership in Seabirds and Waterbirds, and how many obs and </w:t>
-      </w:r>
-      <w:r>
-        <w:rPr>
-          <w:highlight w:val="yellow"/>
-        </w:rPr>
-        <w:t>in what years</w:t>
-      </w:r>
-      <w:r>
-        <w:t>.</w:t>
-      </w:r>
-      <w:r>
-        <w:t xml:space="preserve"> Should this use raw data or</w:t>
-      </w:r>
-      <w:r>
-        <w:t xml:space="preserve"> aggregated??</w:t>
+        <w:t xml:space="preserve">Figure out why </w:t>
+      </w:r>
+      <w:r>
+        <w:t>aggregated result shapefiles don’t line up right in QGIS</w:t>
       </w:r>
     </w:p>
     <w:p>
@@ -275,6 +251,57 @@
         </w:numPr>
       </w:pPr>
       <w:r>
+        <w:t xml:space="preserve">DONE </w:t>
+      </w:r>
+      <w:r>
+        <w:t xml:space="preserve">Figure out how to combine all species into a single shapefile – 1 each for </w:t>
+      </w:r>
+      <w:r>
+        <w:t>each season and 1 for year round</w:t>
+      </w:r>
+    </w:p>
+    <w:p>
+      <w:pPr>
+        <w:pStyle w:val="ListParagraph"/>
+        <w:numPr>
+          <w:ilvl w:val="0"/>
+          <w:numId w:val="1"/>
+        </w:numPr>
+      </w:pPr>
+      <w:r>
+        <w:t xml:space="preserve">DONE </w:t>
+      </w:r>
+      <w:r>
+        <w:t xml:space="preserve">Create a new rmd document </w:t>
+      </w:r>
+      <w:r>
+        <w:t xml:space="preserve">that builds a table showing every species, its membership in Seabirds and Waterbirds, and how many obs and </w:t>
+      </w:r>
+      <w:r>
+        <w:rPr>
+          <w:highlight w:val="yellow"/>
+        </w:rPr>
+        <w:t>in what years</w:t>
+      </w:r>
+      <w:r>
+        <w:t>.</w:t>
+      </w:r>
+      <w:r>
+        <w:t xml:space="preserve"> Should this use raw data or</w:t>
+      </w:r>
+      <w:r>
+        <w:t xml:space="preserve"> aggregated??</w:t>
+      </w:r>
+    </w:p>
+    <w:p>
+      <w:pPr>
+        <w:pStyle w:val="ListParagraph"/>
+        <w:numPr>
+          <w:ilvl w:val="0"/>
+          <w:numId w:val="1"/>
+        </w:numPr>
+      </w:pPr>
+      <w:r>
         <w:t>DONE</w:t>
       </w:r>
       <w:r>
@@ -327,6 +354,9 @@
         </w:numPr>
       </w:pPr>
       <w:r>
+        <w:t xml:space="preserve">DONE </w:t>
+      </w:r>
+      <w:r>
         <w:t>Add aerial dat</w:t>
       </w:r>
       <w:r>
@@ -342,6 +372,10 @@
         </w:numPr>
       </w:pPr>
       <w:r>
+        <w:lastRenderedPageBreak/>
+        <w:t xml:space="preserve">DONE </w:t>
+      </w:r>
+      <w:r>
         <w:t>Do distance sampling</w:t>
       </w:r>
       <w:r>
@@ -369,7 +403,9 @@
         </w:numPr>
       </w:pPr>
       <w:r>
-        <w:lastRenderedPageBreak/>
+        <w:t xml:space="preserve">IGNORE </w:t>
+      </w:r>
+      <w:r>
         <w:t>Do summary by IMRP Atlantic region</w:t>
       </w:r>
       <w:r>

</xml_diff>